<commit_message>
Episodul 3: forajele au fost inainte de cumparare, nu dupa
Paragraful spunea "cateva luni de la rezervare pana la cumparare", ceea ce
lasa impresia ca studiul geotehnic sumar s-a facut dupa achizitie. Din
conversatiile grupului: forajele au fost in octombrie 2020, promisiunea de
vanzare-cumparare pe 8 februarie 2021, iar cumpararea pe 25 februarie 2021.
Intre promisiune si cumparare au trecut 17 zile, nu luni.

Textul spune acum ca intelegerea cu proprietarul a fost cu aproape cinci luni
inainte, muta forajele pe primul loc in ordinea reala si precizeaza ca terenul
inca nu era al nostru cand le-am facut.

Co-Authored-By: Claude Opus 5 (1M context) <noreply@anthropic.com>
</commit_message>
<xml_diff>
--- a/continut/SERIALUL JUDETULUI/E3_TERENUL/E3_terenul.docx
+++ b/continut/SERIALUL JUDETULUI/E3_TERENUL/E3_terenul.docx
@@ -5850,404 +5850,12 @@
     </w:p>
     <w:p>
       <w:r>
-        <w:t xml:space="preserve">Au </w:t>
-      </w:r>
-      <w:proofErr w:type="spellStart"/>
-      <w:r>
-        <w:t>trecut</w:t>
-      </w:r>
-      <w:proofErr w:type="spellEnd"/>
-      <w:r>
-        <w:t xml:space="preserve"> </w:t>
-      </w:r>
-      <w:proofErr w:type="spellStart"/>
-      <w:r>
-        <w:t>câteva</w:t>
-      </w:r>
-      <w:proofErr w:type="spellEnd"/>
-      <w:r>
-        <w:t xml:space="preserve"> </w:t>
-      </w:r>
-      <w:proofErr w:type="spellStart"/>
-      <w:r>
-        <w:t>luni</w:t>
-      </w:r>
-      <w:proofErr w:type="spellEnd"/>
-      <w:r>
-        <w:t xml:space="preserve"> de la </w:t>
-      </w:r>
-      <w:proofErr w:type="spellStart"/>
-      <w:r>
-        <w:t>rezervare</w:t>
-      </w:r>
-      <w:proofErr w:type="spellEnd"/>
-      <w:r>
-        <w:t xml:space="preserve"> </w:t>
-      </w:r>
-      <w:proofErr w:type="spellStart"/>
-      <w:r>
-        <w:t>până</w:t>
-      </w:r>
-      <w:proofErr w:type="spellEnd"/>
-      <w:r>
-        <w:t xml:space="preserve"> la </w:t>
-      </w:r>
-      <w:proofErr w:type="spellStart"/>
-      <w:r>
-        <w:t>cumpărare</w:t>
-      </w:r>
-      <w:proofErr w:type="spellEnd"/>
-      <w:r>
-        <w:t>.</w:t>
+        <w:t xml:space="preserve">Au trecut aproape cinci luni de când ne-am înțeles cu proprietarul până la cumpărare.</w:t>
       </w:r>
     </w:p>
     <w:p>
       <w:r>
-        <w:t xml:space="preserve">Am </w:t>
-      </w:r>
-      <w:proofErr w:type="spellStart"/>
-      <w:r>
-        <w:t>cerut</w:t>
-      </w:r>
-      <w:proofErr w:type="spellEnd"/>
-      <w:r>
-        <w:t xml:space="preserve"> </w:t>
-      </w:r>
-      <w:proofErr w:type="spellStart"/>
-      <w:r>
-        <w:t>actele</w:t>
-      </w:r>
-      <w:proofErr w:type="spellEnd"/>
-      <w:r>
-        <w:t xml:space="preserve"> </w:t>
-      </w:r>
-      <w:proofErr w:type="spellStart"/>
-      <w:r>
-        <w:t>și</w:t>
-      </w:r>
-      <w:proofErr w:type="spellEnd"/>
-      <w:r>
-        <w:t xml:space="preserve"> </w:t>
-      </w:r>
-      <w:proofErr w:type="spellStart"/>
-      <w:r>
-        <w:t>notarul</w:t>
-      </w:r>
-      <w:proofErr w:type="spellEnd"/>
-      <w:r>
-        <w:t xml:space="preserve"> a </w:t>
-      </w:r>
-      <w:proofErr w:type="spellStart"/>
-      <w:r>
-        <w:t>confirmat</w:t>
-      </w:r>
-      <w:proofErr w:type="spellEnd"/>
-      <w:r>
-        <w:t xml:space="preserve"> </w:t>
-      </w:r>
-      <w:proofErr w:type="spellStart"/>
-      <w:r>
-        <w:t>că</w:t>
-      </w:r>
-      <w:proofErr w:type="spellEnd"/>
-      <w:r>
-        <w:t xml:space="preserve"> e </w:t>
-      </w:r>
-      <w:proofErr w:type="spellStart"/>
-      <w:r>
-        <w:t>în</w:t>
-      </w:r>
-      <w:proofErr w:type="spellEnd"/>
-      <w:r>
-        <w:t xml:space="preserve"> </w:t>
-      </w:r>
-      <w:proofErr w:type="spellStart"/>
-      <w:r>
-        <w:t>regulă</w:t>
-      </w:r>
-      <w:proofErr w:type="spellEnd"/>
-      <w:r>
-        <w:t xml:space="preserve">. Am </w:t>
-      </w:r>
-      <w:proofErr w:type="spellStart"/>
-      <w:r>
-        <w:t>verificat</w:t>
-      </w:r>
-      <w:proofErr w:type="spellEnd"/>
-      <w:r>
-        <w:t xml:space="preserve"> </w:t>
-      </w:r>
-      <w:proofErr w:type="spellStart"/>
-      <w:r>
-        <w:t>repede</w:t>
-      </w:r>
-      <w:proofErr w:type="spellEnd"/>
-      <w:r>
-        <w:t xml:space="preserve"> </w:t>
-      </w:r>
-      <w:proofErr w:type="spellStart"/>
-      <w:r>
-        <w:t>și</w:t>
-      </w:r>
-      <w:proofErr w:type="spellEnd"/>
-      <w:r>
-        <w:t xml:space="preserve"> </w:t>
-      </w:r>
-      <w:proofErr w:type="spellStart"/>
-      <w:r>
-        <w:t>ieftin</w:t>
-      </w:r>
-      <w:proofErr w:type="spellEnd"/>
-      <w:r>
-        <w:t xml:space="preserve"> natura </w:t>
-      </w:r>
-      <w:proofErr w:type="spellStart"/>
-      <w:r>
-        <w:t>terenului</w:t>
-      </w:r>
-      <w:proofErr w:type="spellEnd"/>
-      <w:r>
-        <w:t xml:space="preserve"> de </w:t>
-      </w:r>
-      <w:proofErr w:type="spellStart"/>
-      <w:r>
-        <w:t>fundare</w:t>
-      </w:r>
-      <w:proofErr w:type="spellEnd"/>
-      <w:r>
-        <w:t xml:space="preserve">, cu </w:t>
-      </w:r>
-      <w:proofErr w:type="spellStart"/>
-      <w:r>
-        <w:t>două</w:t>
-      </w:r>
-      <w:proofErr w:type="spellEnd"/>
-      <w:r>
-        <w:t xml:space="preserve"> </w:t>
-      </w:r>
-      <w:proofErr w:type="spellStart"/>
-      <w:r>
-        <w:t>foraje</w:t>
-      </w:r>
-      <w:proofErr w:type="spellEnd"/>
-      <w:r>
-        <w:t xml:space="preserve"> </w:t>
-      </w:r>
-      <w:proofErr w:type="spellStart"/>
-      <w:r>
-        <w:t>și</w:t>
-      </w:r>
-      <w:proofErr w:type="spellEnd"/>
-      <w:r>
-        <w:t xml:space="preserve"> o </w:t>
-      </w:r>
-      <w:proofErr w:type="spellStart"/>
-      <w:r>
-        <w:t>dezvelire</w:t>
-      </w:r>
-      <w:proofErr w:type="spellEnd"/>
-      <w:r>
-        <w:t xml:space="preserve"> de </w:t>
-      </w:r>
-      <w:proofErr w:type="spellStart"/>
-      <w:r>
-        <w:t>fundație</w:t>
-      </w:r>
-      <w:proofErr w:type="spellEnd"/>
-      <w:r>
-        <w:t xml:space="preserve"> la </w:t>
-      </w:r>
-      <w:proofErr w:type="spellStart"/>
-      <w:r>
-        <w:t>calcan</w:t>
-      </w:r>
-      <w:proofErr w:type="spellEnd"/>
-      <w:r>
-        <w:t xml:space="preserve">; </w:t>
-      </w:r>
-      <w:proofErr w:type="spellStart"/>
-      <w:r>
-        <w:t>dacă</w:t>
-      </w:r>
-      <w:proofErr w:type="spellEnd"/>
-      <w:r>
-        <w:t xml:space="preserve"> </w:t>
-      </w:r>
-      <w:proofErr w:type="spellStart"/>
-      <w:r>
-        <w:t>ieșea</w:t>
-      </w:r>
-      <w:proofErr w:type="spellEnd"/>
-      <w:r>
-        <w:t xml:space="preserve"> prost, </w:t>
-      </w:r>
-      <w:proofErr w:type="spellStart"/>
-      <w:r>
-        <w:t>trebuia</w:t>
-      </w:r>
-      <w:proofErr w:type="spellEnd"/>
-      <w:r>
-        <w:t xml:space="preserve"> </w:t>
-      </w:r>
-      <w:proofErr w:type="spellStart"/>
-      <w:r>
-        <w:t>să</w:t>
-      </w:r>
-      <w:proofErr w:type="spellEnd"/>
-      <w:r>
-        <w:t xml:space="preserve"> </w:t>
-      </w:r>
-      <w:proofErr w:type="spellStart"/>
-      <w:r>
-        <w:t>fundăm</w:t>
-      </w:r>
-      <w:proofErr w:type="spellEnd"/>
-      <w:r>
-        <w:t xml:space="preserve"> </w:t>
-      </w:r>
-      <w:proofErr w:type="spellStart"/>
-      <w:r>
-        <w:t>adânc</w:t>
-      </w:r>
-      <w:proofErr w:type="spellEnd"/>
-      <w:r>
-        <w:t xml:space="preserve"> </w:t>
-      </w:r>
-      <w:proofErr w:type="spellStart"/>
-      <w:r>
-        <w:t>și</w:t>
-      </w:r>
-      <w:proofErr w:type="spellEnd"/>
-      <w:r>
-        <w:t xml:space="preserve"> </w:t>
-      </w:r>
-      <w:proofErr w:type="spellStart"/>
-      <w:r>
-        <w:t>creșteau</w:t>
-      </w:r>
-      <w:proofErr w:type="spellEnd"/>
-      <w:r>
-        <w:t xml:space="preserve"> </w:t>
-      </w:r>
-      <w:proofErr w:type="spellStart"/>
-      <w:r>
-        <w:t>costurile</w:t>
-      </w:r>
-      <w:proofErr w:type="spellEnd"/>
-      <w:r>
-        <w:t xml:space="preserve">. Am </w:t>
-      </w:r>
-      <w:proofErr w:type="spellStart"/>
-      <w:r>
-        <w:t>discutat</w:t>
-      </w:r>
-      <w:proofErr w:type="spellEnd"/>
-      <w:r>
-        <w:t xml:space="preserve"> cu </w:t>
-      </w:r>
-      <w:proofErr w:type="spellStart"/>
-      <w:r>
-        <w:t>grupul</w:t>
-      </w:r>
-      <w:proofErr w:type="spellEnd"/>
-      <w:r>
-        <w:t xml:space="preserve"> </w:t>
-      </w:r>
-      <w:proofErr w:type="spellStart"/>
-      <w:r>
-        <w:t>și</w:t>
-      </w:r>
-      <w:proofErr w:type="spellEnd"/>
-      <w:r>
-        <w:t xml:space="preserve"> am </w:t>
-      </w:r>
-      <w:proofErr w:type="spellStart"/>
-      <w:r>
-        <w:t>detaliat</w:t>
-      </w:r>
-      <w:proofErr w:type="spellEnd"/>
-      <w:r>
-        <w:t xml:space="preserve"> </w:t>
-      </w:r>
-      <w:proofErr w:type="spellStart"/>
-      <w:r>
-        <w:t>configurațiile</w:t>
-      </w:r>
-      <w:proofErr w:type="spellEnd"/>
-      <w:r>
-        <w:t xml:space="preserve"> </w:t>
-      </w:r>
-      <w:proofErr w:type="spellStart"/>
-      <w:r>
-        <w:t>apartamentelor</w:t>
-      </w:r>
-      <w:proofErr w:type="spellEnd"/>
-      <w:r>
-        <w:t xml:space="preserve">, </w:t>
-      </w:r>
-      <w:proofErr w:type="spellStart"/>
-      <w:r>
-        <w:t>suprafețele</w:t>
-      </w:r>
-      <w:proofErr w:type="spellEnd"/>
-      <w:r>
-        <w:t xml:space="preserve">, </w:t>
-      </w:r>
-      <w:proofErr w:type="spellStart"/>
-      <w:r>
-        <w:t>câteva</w:t>
-      </w:r>
-      <w:proofErr w:type="spellEnd"/>
-      <w:r>
-        <w:t xml:space="preserve"> </w:t>
-      </w:r>
-      <w:proofErr w:type="spellStart"/>
-      <w:r>
-        <w:t>imagini</w:t>
-      </w:r>
-      <w:proofErr w:type="spellEnd"/>
-      <w:r>
-        <w:t xml:space="preserve">, </w:t>
-      </w:r>
-      <w:proofErr w:type="spellStart"/>
-      <w:r>
-        <w:t>iar</w:t>
-      </w:r>
-      <w:proofErr w:type="spellEnd"/>
-      <w:r>
-        <w:t xml:space="preserve"> </w:t>
-      </w:r>
-      <w:proofErr w:type="spellStart"/>
-      <w:r>
-        <w:t>soluția</w:t>
-      </w:r>
-      <w:proofErr w:type="spellEnd"/>
-      <w:r>
-        <w:t xml:space="preserve"> am </w:t>
-      </w:r>
-      <w:proofErr w:type="spellStart"/>
-      <w:r>
-        <w:t>confirmat</w:t>
-      </w:r>
-      <w:proofErr w:type="spellEnd"/>
-      <w:r>
-        <w:t xml:space="preserve">-o </w:t>
-      </w:r>
-      <w:proofErr w:type="spellStart"/>
-      <w:r>
-        <w:t>și</w:t>
-      </w:r>
-      <w:proofErr w:type="spellEnd"/>
-      <w:r>
-        <w:t xml:space="preserve"> la </w:t>
-      </w:r>
-      <w:proofErr w:type="spellStart"/>
-      <w:r>
-        <w:t>primărie</w:t>
-      </w:r>
-      <w:proofErr w:type="spellEnd"/>
-      <w:r>
-        <w:t>.</w:t>
+        <w:t xml:space="preserve">În octombrie am verificat repede și ieftin natura terenului de fundare, cu două foraje și o dezvelire de fundație la calcan, încă înainte ca terenul să fie al nostru, cu acordul proprietarului; dacă ieșea prost, trebuia să fundăm adânc și creșteau costurile. Am cerut actele și notarul a confirmat că sunt în regulă. Am discutat cu grupul și am detaliat configurațiile apartamentelor, suprafețele, câteva imagini, iar soluția am confirmat-o și la primărie. Promisiunea de vânzare-cumpărare am semnat-o în februarie, iar terenul l-am cumpărat două săptămâni și jumătate mai târziu.</w:t>
       </w:r>
     </w:p>
     <w:p>

</xml_diff>